<commit_message>
Spotkania łączone kroków 2+3, 6+7, 8+9, 10+11 (wersja 10-spotkaniowa)
- konspekty łączone w „10 spotkań/” do elastycznego skracania cyklu
- build.sh buduje także PDF/DOCX spotkań łączonych
- instrukcja szczegółowa: część 7 (spotkania łączone), weryfikacja cytatów przenoszonych z innych konspektów
- krok 9: poprawione cytaty Łk 14,28 i Piusa XI

Co-Authored-By: Claude Opus 5 <noreply@anthropic.com>
</commit_message>
<xml_diff>
--- a/12-kroków-konspekty-spotkań/do-druku/docx/krok-09-zadoscuczynienie.docx
+++ b/12-kroków-konspekty-spotkań/do-druku/docx/krok-09-zadoscuczynienie.docx
@@ -358,7 +358,7 @@
         <w:rPr>
           <w:lang w:val="pl"/>
         </w:rPr>
-        <w:t xml:space="preserve">Łk 14,28-32 — kto chce budować wieżę, „usiądzie wpierw i oblicza wydatki”: zadośćuczynienie wymaga roztropnego rozeznania.</w:t>
+        <w:t xml:space="preserve">Łk 14,28-32 — „któż z was, chcąc zbudować wieżę, nie usiądzie wpierw i nie oblicza wydatków” — zadośćuczynienie wymaga roztropnego rozeznania.</w:t>
       </w:r>
     </w:p>
     <w:p>
@@ -850,15 +850,21 @@
         <w:rPr>
           <w:lang w:val="pl"/>
         </w:rPr>
-        <w:t xml:space="preserve">Wszelkie nasze zadośćuczynienie ma swoje źródło w krzyżu Chrystusa, który naprawił to, czego my nie jesteśmy w stanie naprawić. Papież Pius XI pisał, że jesteśmy zobowiązani do naprawienia krzywd „</w:t>
-      </w:r>
-      <w:r>
-        <w:rPr>
-          <w:b/>
-          <w:bCs/>
-          <w:lang w:val="pl"/>
-        </w:rPr>
-        <w:t xml:space="preserve">z tytułu sprawiedliwości i miłości</w:t>
+        <w:t xml:space="preserve">Wszelkie nasze zadośćuczynienie ma swoje źródło w krzyżu Chrystusa, który naprawił to, czego my nie jesteśmy w stanie naprawić. Papież Pius XI pisał, że jesteśmy zobowiązani do zadośćuczynienia i ekspiacji „z pewnego jeszcze mocniejszego</w:t>
+      </w:r>
+      <w:r>
+        <w:rPr>
+          <w:lang w:val="pl"/>
+        </w:rPr>
+        <w:t xml:space="preserve"> </w:t>
+      </w:r>
+      <w:r>
+        <w:rPr>
+          <w:b/>
+          <w:bCs/>
+          <w:lang w:val="pl"/>
+        </w:rPr>
+        <w:t xml:space="preserve">tytułu sprawiedliwości i miłości</w:t>
       </w:r>
       <w:r>
         <w:rPr>

</xml_diff>